<commit_message>
Add Word TOC field to DOCX reports + add_toc.py
</commit_message>
<xml_diff>
--- a/ET_FORMATO_INFORME_API0101.docx
+++ b/ET_FORMATO_INFORME_API0101.docx
@@ -173,6 +173,43 @@
       <w:pPr>
         <w:pStyle w:val="Ttulo1"/>
       </w:pPr>
+    </w:p>
+    <w:p>
+      <w:pPr>
+        <w:pStyle w:val="Ttulo1"/>
+      </w:pPr>
+      <w:r>
+        <w:rPr>
+          <w:b/>
+          <w:sz w:val="28"/>
+        </w:rPr>
+        <w:t>ÍNDICE</w:t>
+      </w:r>
+    </w:p>
+    <w:p>
+      <w:pPr>
+        <w:spacing w:before="120" w:after="120"/>
+      </w:pPr>
+      <w:r>
+        <w:rPr/>
+        <w:fldChar w:fldCharType="begin"/>
+      </w:r>
+      <w:r>
+        <w:rPr/>
+        <w:instrText xml:space="preserve">TOC \o "1-2" \h \z \u</w:instrText>
+      </w:r>
+      <w:r>
+        <w:rPr/>
+        <w:fldChar w:fldCharType="separate"/>
+      </w:r>
+      <w:r>
+        <w:rPr/>
+        <w:t xml:space="preserve">[Actualizar indice: clic derecho &gt; Actualizar campo]</w:t>
+      </w:r>
+      <w:r>
+        <w:rPr/>
+        <w:fldChar w:fldCharType="end"/>
+      </w:r>
     </w:p>
     <w:p>
       <w:pPr>

</xml_diff>